<commit_message>
Update Choice, Advocacy and Control Policy to match actual practice
Feedback and complaints are collected via the website rather than a
paper form, dignity-of-risk decisions are documented with the Risk
Assessment we complete per participant rather than a Risk Taking
Form, and the annual survey commitment is replaced with the ongoing
feedback-seeking we actually do.
</commit_message>
<xml_diff>
--- a/server/templates/library/choice-advocacy-and-control-policy/template.docx
+++ b/server/templates/library/choice-advocacy-and-control-policy/template.docx
@@ -1711,14 +1711,7 @@
                 <w:rFonts w:ascii="Arial" w:cs="Arial" w:eastAsia="Arial" w:hAnsi="Arial"/>
                 <w:rtl w:val="0"/>
               </w:rPr>
-              <w:t xml:space="preserve">a </w:t>
-            </w:r>
-            <w:r>
-              <w:rPr>
-                <w:rFonts w:ascii="Arial" w:cs="Arial" w:eastAsia="Arial" w:hAnsi="Arial"/>
-                <w:rtl w:val="0"/>
-              </w:rPr>
-              <w:t>Advocacy or Support Person Request Form; and</w:t>
+              <w:t xml:space="preserve">a Advocacy or Support Person Request Form; and</w:t>
             </w:r>
           </w:p>
           <w:p>
@@ -1737,7 +1730,7 @@
                 <w:rFonts w:ascii="Arial" w:cs="Arial" w:eastAsia="Arial" w:hAnsi="Arial"/>
                 <w:rtl w:val="0"/>
               </w:rPr>
-              <w:t>a Feedback and Complaints Form and Summary.</w:t>
+              <w:t>information on how to provide feedback or make a complaint through our website (spring2health.com.au).</w:t>
             </w:r>
             <w:r>
               <w:rPr>
@@ -2827,7 +2820,7 @@
                 <w:rFonts w:ascii="Arial" w:cs="Arial" w:eastAsia="Arial" w:hAnsi="Arial"/>
                 <w:rtl w:val="0"/>
               </w:rPr>
-              <w:t>Depending on the severity of the risk, complete a Risk Taking Form to facilitate the management of such risk. Give a signed copy of the Risk Taking Form to the Client and keep a copy in the Client’s file.</w:t>
+              <w:t>Depending on the severity of the risk, complete a Risk Assessment for the participant using the Risk Assessment Form to facilitate the management of such risk. Give a copy of the Risk Assessment to the Client and keep a copy in the Client’s file.</w:t>
             </w:r>
           </w:p>
           <w:p>
@@ -3744,7 +3737,7 @@
                 <w:rFonts w:ascii="Arial" w:cs="Arial" w:eastAsia="Arial" w:hAnsi="Arial"/>
                 <w:rtl w:val="0"/>
               </w:rPr>
-              <w:t>Conduct an annual survey of all Workers, Clients, their support networks and other stakeholders and ask them to suggest areas for improvement in relation to {org.name}’s application of this Policy including its commitment to the Client making informed choices, exercising control and maximising their independence relating to the services and supports provided.</w:t>
+              <w:t>Actively seek and welcome feedback from Workers, Clients, their support networks and other stakeholders on an ongoing basis (including through our website) and use it to suggest areas for improvement in relation to {org.name}’s application of this Policy including its commitment to the Client making informed choices, exercising control and maximising their independence relating to the services and supports provided.</w:t>
             </w:r>
           </w:p>
         </w:tc>
@@ -4386,11 +4379,6 @@
           <w:rtl w:val="0"/>
         </w:rPr>
         <w:t>Legislation, Rules, Guidelines and Policies apply to this Policy and Related Documentation  as set out in the Legislation Register.</w:t>
-      </w:r>
-      <w:r>
-        <w:rPr>
-          <w:rtl w:val="0"/>
-        </w:rPr>
       </w:r>
     </w:p>
     <w:p>

</xml_diff>

<commit_message>
Replace 'the Board' governance language across policy templates
Spring 2 Health is owner/director-managed with no formal board, so
policy 'Approved By' footers and 'Policy adoption' responsibility
labels referencing 'The Board' now reference the Director instead.
Governance Policy itself is excluded here — it needs a fuller rewrite
since it's specifically about board governance structure.
</commit_message>
<xml_diff>
--- a/server/templates/library/choice-advocacy-and-control-policy/template.docx
+++ b/server/templates/library/choice-advocacy-and-control-policy/template.docx
@@ -1361,7 +1361,7 @@
           <w:vertAlign w:val="baseline"/>
           <w:rtl w:val="0"/>
         </w:rPr>
-        <w:t xml:space="preserve">The Policy is supported by the following Procedures which are intended to clarify the responsibilities of the board, Principal, Key Management Personnel and other Workers and make explicit the underlying principles of the Policy. The Procedures work together dynamically and are relevant to all parts of </w:t>
+        <w:t xml:space="preserve">The Policy is supported by the following Procedures which are intended to clarify the responsibilities of Principal, Key Management Personnel and other Workers and make explicit the underlying principles of the Policy. The Procedures work together dynamically and are relevant to all parts of </w:t>
       </w:r>
       <w:r>
         <w:rPr>
@@ -4281,7 +4281,7 @@
                 <w:b w:val="1"/>
                 <w:rtl w:val="0"/>
               </w:rPr>
-              <w:t>The board</w:t>
+              <w:t>The Director</w:t>
             </w:r>
           </w:p>
         </w:tc>
@@ -4522,7 +4522,7 @@
         <w:rPr>
           <w:rtl w:val="0"/>
         </w:rPr>
-        <w:t>The Board of {org.legal_name}</w:t>
+        <w:t>{org.signatory.name}, Director of {org.legal_name}</w:t>
       </w:r>
     </w:p>
     <w:p>

</xml_diff>

<commit_message>
Revert Spring 2 Health-specific policy edits back to generic wording
Master templates in server/templates/library are shared across every
org that clones them, and org clones only override placeholder
values (org name, ABN, etc.) - not full sentences. Baking Spring 2
Health-specific practice (feedback via website, no board, no annual
survey, lighter-touch COVID protocol) into the shared masters would
incorrectly apply to every future org on the platform. Reverting to
the original generic wording until per-org content overrides exist.
</commit_message>
<xml_diff>
--- a/server/templates/library/choice-advocacy-and-control-policy/template.docx
+++ b/server/templates/library/choice-advocacy-and-control-policy/template.docx
@@ -1361,7 +1361,7 @@
           <w:vertAlign w:val="baseline"/>
           <w:rtl w:val="0"/>
         </w:rPr>
-        <w:t xml:space="preserve">The Policy is supported by the following Procedures which are intended to clarify the responsibilities of Principal, Key Management Personnel and other Workers and make explicit the underlying principles of the Policy. The Procedures work together dynamically and are relevant to all parts of </w:t>
+        <w:t xml:space="preserve">The Policy is supported by the following Procedures which are intended to clarify the responsibilities of the board, Principal, Key Management Personnel and other Workers and make explicit the underlying principles of the Policy. The Procedures work together dynamically and are relevant to all parts of </w:t>
       </w:r>
       <w:r>
         <w:rPr>
@@ -1711,7 +1711,14 @@
                 <w:rFonts w:ascii="Arial" w:cs="Arial" w:eastAsia="Arial" w:hAnsi="Arial"/>
                 <w:rtl w:val="0"/>
               </w:rPr>
-              <w:t xml:space="preserve">a Advocacy or Support Person Request Form; and</w:t>
+              <w:t xml:space="preserve">a </w:t>
+            </w:r>
+            <w:r>
+              <w:rPr>
+                <w:rFonts w:ascii="Arial" w:cs="Arial" w:eastAsia="Arial" w:hAnsi="Arial"/>
+                <w:rtl w:val="0"/>
+              </w:rPr>
+              <w:t>Advocacy or Support Person Request Form; and</w:t>
             </w:r>
           </w:p>
           <w:p>
@@ -1730,7 +1737,7 @@
                 <w:rFonts w:ascii="Arial" w:cs="Arial" w:eastAsia="Arial" w:hAnsi="Arial"/>
                 <w:rtl w:val="0"/>
               </w:rPr>
-              <w:t>information on how to provide feedback or make a complaint through our website (spring2health.com.au).</w:t>
+              <w:t>a Feedback and Complaints Form and Summary.</w:t>
             </w:r>
             <w:r>
               <w:rPr>
@@ -2820,7 +2827,7 @@
                 <w:rFonts w:ascii="Arial" w:cs="Arial" w:eastAsia="Arial" w:hAnsi="Arial"/>
                 <w:rtl w:val="0"/>
               </w:rPr>
-              <w:t>Depending on the severity of the risk, complete a Risk Assessment for the participant using the Risk Assessment Form to facilitate the management of such risk. Give a copy of the Risk Assessment to the Client and keep a copy in the Client’s file.</w:t>
+              <w:t>Depending on the severity of the risk, complete a Risk Taking Form to facilitate the management of such risk. Give a signed copy of the Risk Taking Form to the Client and keep a copy in the Client’s file.</w:t>
             </w:r>
           </w:p>
           <w:p>
@@ -3737,7 +3744,7 @@
                 <w:rFonts w:ascii="Arial" w:cs="Arial" w:eastAsia="Arial" w:hAnsi="Arial"/>
                 <w:rtl w:val="0"/>
               </w:rPr>
-              <w:t>Actively seek and welcome feedback from Workers, Clients, their support networks and other stakeholders on an ongoing basis (including through our website) and use it to suggest areas for improvement in relation to {org.name}’s application of this Policy including its commitment to the Client making informed choices, exercising control and maximising their independence relating to the services and supports provided.</w:t>
+              <w:t>Conduct an annual survey of all Workers, Clients, their support networks and other stakeholders and ask them to suggest areas for improvement in relation to {org.name}’s application of this Policy including its commitment to the Client making informed choices, exercising control and maximising their independence relating to the services and supports provided.</w:t>
             </w:r>
           </w:p>
         </w:tc>
@@ -4281,7 +4288,7 @@
                 <w:b w:val="1"/>
                 <w:rtl w:val="0"/>
               </w:rPr>
-              <w:t>The Director</w:t>
+              <w:t>The board</w:t>
             </w:r>
           </w:p>
         </w:tc>
@@ -4380,6 +4387,11 @@
         </w:rPr>
         <w:t>Legislation, Rules, Guidelines and Policies apply to this Policy and Related Documentation  as set out in the Legislation Register.</w:t>
       </w:r>
+      <w:r>
+        <w:rPr>
+          <w:rtl w:val="0"/>
+        </w:rPr>
+      </w:r>
     </w:p>
     <w:p>
       <w:pPr>
@@ -4522,7 +4534,7 @@
         <w:rPr>
           <w:rtl w:val="0"/>
         </w:rPr>
-        <w:t>{org.signatory.name}, Director of {org.legal_name}</w:t>
+        <w:t>The Board of {org.legal_name}</w:t>
       </w:r>
     </w:p>
     <w:p>

</xml_diff>